<commit_message>
Actualizo documentos legales: nombres, roles, acciones y fechas
- Estatuto F: nombres sin corchetes, roles en firmas, David Gutierrez Gavilanes (CC 1001186476)
- Founder Agreement: 10.000 acciones / 2.000 por socio, vesting corregido, firmas con roles reales
- Todos los docs: fecha 2025->2026, NIT [PENDIENTE], email pymia40@gmail.com
- Elimina PYMIA_Estatutos_SAS.docx (duplicado de Estatuto F)

Co-Authored-By: Claude Sonnet 4.6 <noreply@anthropic.com>
</commit_message>
<xml_diff>
--- a/Documentos Legales/PYMIA_Estatuto F.docx
+++ b/Documentos Legales/PYMIA_Estatuto F.docx
@@ -906,7 +906,7 @@
                 <w:sz w:val="20"/>
                 <w:szCs w:val="20"/>
               </w:rPr>
-              <w:t xml:space="preserve">[FUNDADOR 1 — </w:t>
+              <w:t>Juan José Trujillo Trujillo</w:t>
             </w:r>
             <w:r>
               <w:rPr>
@@ -915,7 +915,6 @@
                 <w:sz w:val="20"/>
                 <w:szCs w:val="20"/>
               </w:rPr>
-              <w:t>Juan José Trujillo Trujillo</w:t>
             </w:r>
             <w:r>
               <w:rPr>
@@ -924,7 +923,6 @@
                 <w:sz w:val="20"/>
                 <w:szCs w:val="20"/>
               </w:rPr>
-              <w:t>]</w:t>
             </w:r>
           </w:p>
         </w:tc>
@@ -1080,7 +1078,7 @@
                 <w:sz w:val="20"/>
                 <w:szCs w:val="20"/>
               </w:rPr>
-              <w:t>[FUNDADOR 2 — Mario Andrés Huertas Arango</w:t>
+              <w:t>Mario Andrés Huertas Arango</w:t>
             </w:r>
             <w:r>
               <w:rPr>
@@ -1089,7 +1087,6 @@
                 <w:sz w:val="20"/>
                 <w:szCs w:val="20"/>
               </w:rPr>
-              <w:t>]</w:t>
             </w:r>
           </w:p>
         </w:tc>
@@ -1245,7 +1242,7 @@
                 <w:sz w:val="20"/>
                 <w:szCs w:val="20"/>
               </w:rPr>
-              <w:t>[FUNDADOR 3 — Samuel Santiago Puentes Rubiano</w:t>
+              <w:t>Samuel Santiago Puentes Rubiano</w:t>
             </w:r>
             <w:r>
               <w:rPr>
@@ -1254,7 +1251,6 @@
                 <w:sz w:val="20"/>
                 <w:szCs w:val="20"/>
               </w:rPr>
-              <w:t>]</w:t>
             </w:r>
           </w:p>
         </w:tc>
@@ -1410,7 +1406,7 @@
                 <w:sz w:val="20"/>
                 <w:szCs w:val="20"/>
               </w:rPr>
-              <w:t>[FUNDADOR 4 — David Gutierrez]</w:t>
+              <w:t>David Gutierrez Gavilanes</w:t>
             </w:r>
           </w:p>
         </w:tc>
@@ -1566,7 +1562,7 @@
                 <w:sz w:val="20"/>
                 <w:szCs w:val="20"/>
               </w:rPr>
-              <w:t>[FUNDADOR 5 — Oscar David Roa Rativa</w:t>
+              <w:t>Oscar David Roa Rativa</w:t>
             </w:r>
             <w:r>
               <w:rPr>
@@ -1575,7 +1571,6 @@
                 <w:sz w:val="20"/>
                 <w:szCs w:val="20"/>
               </w:rPr>
-              <w:t>]</w:t>
             </w:r>
           </w:p>
         </w:tc>
@@ -2402,7 +2397,7 @@
           <w:rFonts w:ascii="Bahnschrift SemiBold" w:hAnsi="Bahnschrift SemiBold" w:cstheme="minorHAnsi"/>
           <w:color w:val="1A1A1A"/>
         </w:rPr>
-        <w:t>es el señor DAVID GUTIERREZ, identificado con Cédu</w:t>
+        <w:t>es el señor DAVID GUTIERREZ GAVILANES, identificado con Cédu</w:t>
       </w:r>
       <w:r>
         <w:rPr>
@@ -2964,43 +2959,39 @@
           <w:bCs/>
           <w:color w:val="1A1A1A"/>
         </w:rPr>
-        <w:t xml:space="preserve">[FUNDADOR 1 — </w:t>
-      </w:r>
-      <w:r>
-        <w:rPr>
-          <w:rFonts w:ascii="Bahnschrift SemiBold" w:hAnsi="Bahnschrift SemiBold" w:cstheme="minorHAnsi"/>
-          <w:b/>
-          <w:bCs/>
-          <w:color w:val="1A1A1A"/>
-        </w:rPr>
-        <w:t xml:space="preserve">Juan </w:t>
-      </w:r>
-      <w:r>
-        <w:rPr>
-          <w:rFonts w:ascii="Bahnschrift SemiBold" w:hAnsi="Bahnschrift SemiBold" w:cstheme="minorHAnsi"/>
-          <w:b/>
-          <w:bCs/>
-          <w:color w:val="1A1A1A"/>
-        </w:rPr>
-        <w:t>José</w:t>
-      </w:r>
-      <w:r>
-        <w:rPr>
-          <w:rFonts w:ascii="Bahnschrift SemiBold" w:hAnsi="Bahnschrift SemiBold" w:cstheme="minorHAnsi"/>
-          <w:b/>
-          <w:bCs/>
-          <w:color w:val="1A1A1A"/>
-        </w:rPr>
-        <w:t xml:space="preserve"> Trujillo Trujillo</w:t>
-      </w:r>
-      <w:r>
-        <w:rPr>
-          <w:rFonts w:ascii="Bahnschrift SemiBold" w:hAnsi="Bahnschrift SemiBold" w:cstheme="minorHAnsi"/>
-          <w:b/>
-          <w:bCs/>
-          <w:color w:val="1A1A1A"/>
-        </w:rPr>
-        <w:t>]</w:t>
+        <w:t>Juan José Trujillo Trujillo</w:t>
+      </w:r>
+      <w:r>
+        <w:rPr>
+          <w:rFonts w:ascii="Bahnschrift SemiBold" w:hAnsi="Bahnschrift SemiBold" w:cstheme="minorHAnsi"/>
+          <w:b/>
+          <w:bCs/>
+          <w:color w:val="1A1A1A"/>
+        </w:rPr>
+      </w:r>
+      <w:r>
+        <w:rPr>
+          <w:rFonts w:ascii="Bahnschrift SemiBold" w:hAnsi="Bahnschrift SemiBold" w:cstheme="minorHAnsi"/>
+          <w:b/>
+          <w:bCs/>
+          <w:color w:val="1A1A1A"/>
+        </w:rPr>
+      </w:r>
+      <w:r>
+        <w:rPr>
+          <w:rFonts w:ascii="Bahnschrift SemiBold" w:hAnsi="Bahnschrift SemiBold" w:cstheme="minorHAnsi"/>
+          <w:b/>
+          <w:bCs/>
+          <w:color w:val="1A1A1A"/>
+        </w:rPr>
+      </w:r>
+      <w:r>
+        <w:rPr>
+          <w:rFonts w:ascii="Bahnschrift SemiBold" w:hAnsi="Bahnschrift SemiBold" w:cstheme="minorHAnsi"/>
+          <w:b/>
+          <w:bCs/>
+          <w:color w:val="1A1A1A"/>
+        </w:rPr>
       </w:r>
     </w:p>
     <w:p>
@@ -3026,7 +3017,7 @@
           <w:sz w:val="20"/>
           <w:szCs w:val="20"/>
         </w:rPr>
-        <w:t>N.° _________________ | Accionista Fundador | 20%</w:t>
+        <w:t>N.° _________________ | CEO — Estrategia General, Prospección &amp; Financiero | 20%</w:t>
       </w:r>
     </w:p>
     <w:p>
@@ -3046,34 +3037,31 @@
           <w:bCs/>
           <w:color w:val="1A1A1A"/>
         </w:rPr>
-        <w:t xml:space="preserve">[FUNDADOR 2 — Mario </w:t>
-      </w:r>
-      <w:r>
-        <w:rPr>
-          <w:rFonts w:ascii="Bahnschrift SemiBold" w:hAnsi="Bahnschrift SemiBold" w:cstheme="minorHAnsi"/>
-          <w:b/>
-          <w:bCs/>
-          <w:color w:val="1A1A1A"/>
-        </w:rPr>
-        <w:t>Andrés</w:t>
-      </w:r>
-      <w:r>
-        <w:rPr>
-          <w:rFonts w:ascii="Bahnschrift SemiBold" w:hAnsi="Bahnschrift SemiBold" w:cstheme="minorHAnsi"/>
-          <w:b/>
-          <w:bCs/>
-          <w:color w:val="1A1A1A"/>
-        </w:rPr>
-        <w:t xml:space="preserve"> Huertas Arango</w:t>
-      </w:r>
-      <w:r>
-        <w:rPr>
-          <w:rFonts w:ascii="Bahnschrift SemiBold" w:hAnsi="Bahnschrift SemiBold" w:cstheme="minorHAnsi"/>
-          <w:b/>
-          <w:bCs/>
-          <w:color w:val="1A1A1A"/>
-        </w:rPr>
-        <w:t>]</w:t>
+        <w:t>Mario Andrés Huertas Arango</w:t>
+      </w:r>
+      <w:r>
+        <w:rPr>
+          <w:rFonts w:ascii="Bahnschrift SemiBold" w:hAnsi="Bahnschrift SemiBold" w:cstheme="minorHAnsi"/>
+          <w:b/>
+          <w:bCs/>
+          <w:color w:val="1A1A1A"/>
+        </w:rPr>
+      </w:r>
+      <w:r>
+        <w:rPr>
+          <w:rFonts w:ascii="Bahnschrift SemiBold" w:hAnsi="Bahnschrift SemiBold" w:cstheme="minorHAnsi"/>
+          <w:b/>
+          <w:bCs/>
+          <w:color w:val="1A1A1A"/>
+        </w:rPr>
+      </w:r>
+      <w:r>
+        <w:rPr>
+          <w:rFonts w:ascii="Bahnschrift SemiBold" w:hAnsi="Bahnschrift SemiBold" w:cstheme="minorHAnsi"/>
+          <w:b/>
+          <w:bCs/>
+          <w:color w:val="1A1A1A"/>
+        </w:rPr>
       </w:r>
     </w:p>
     <w:p>
@@ -3101,7 +3089,7 @@
           <w:sz w:val="20"/>
           <w:szCs w:val="20"/>
         </w:rPr>
-        <w:t>________ | Accionista Fundador | 20%</w:t>
+        <w:t>________ | Director Financiero &amp; Tecnología | 20%</w:t>
       </w:r>
     </w:p>
     <w:p>
@@ -3121,15 +3109,6 @@
           <w:bCs/>
           <w:color w:val="1A1A1A"/>
         </w:rPr>
-        <w:t xml:space="preserve">[FUNDADOR 3 — </w:t>
-      </w:r>
-      <w:r>
-        <w:rPr>
-          <w:rFonts w:ascii="Bahnschrift SemiBold" w:hAnsi="Bahnschrift SemiBold" w:cstheme="minorHAnsi"/>
-          <w:b/>
-          <w:bCs/>
-          <w:color w:val="1A1A1A"/>
-        </w:rPr>
         <w:t>Samuel Santiago Puentes Rubiano</w:t>
       </w:r>
       <w:r>
@@ -3139,7 +3118,14 @@
           <w:bCs/>
           <w:color w:val="1A1A1A"/>
         </w:rPr>
-        <w:t>]</w:t>
+      </w:r>
+      <w:r>
+        <w:rPr>
+          <w:rFonts w:ascii="Bahnschrift SemiBold" w:hAnsi="Bahnschrift SemiBold" w:cstheme="minorHAnsi"/>
+          <w:b/>
+          <w:bCs/>
+          <w:color w:val="1A1A1A"/>
+        </w:rPr>
       </w:r>
     </w:p>
     <w:p>
@@ -3156,7 +3142,7 @@
           <w:sz w:val="20"/>
           <w:szCs w:val="20"/>
         </w:rPr>
-        <w:t>C.C. N.° _________________ | Accionista Fundador | 20%</w:t>
+        <w:t>C.C. N.° _________________ | Director Comercial &amp; Innovación | 20%</w:t>
       </w:r>
     </w:p>
     <w:p>
@@ -3176,7 +3162,7 @@
           <w:bCs/>
           <w:color w:val="1A1A1A"/>
         </w:rPr>
-        <w:t>David Gutierrez</w:t>
+        <w:t>David Gutierrez Gavilanes</w:t>
       </w:r>
     </w:p>
     <w:p>
@@ -3202,7 +3188,7 @@
           <w:sz w:val="20"/>
           <w:szCs w:val="20"/>
         </w:rPr>
-        <w:t xml:space="preserve"> | Representante Legal &amp; Accionista Fundador | 20%</w:t>
+        <w:t xml:space="preserve"> | Representante Legal &amp; Director de Operaciones &amp; Éxito del Cliente | 20%</w:t>
       </w:r>
     </w:p>
     <w:p>
@@ -3222,16 +3208,15 @@
           <w:bCs/>
           <w:color w:val="1A1A1A"/>
         </w:rPr>
-        <w:t>[FUNDADOR 5 — Oscar David Roa Rativa</w:t>
-      </w:r>
-      <w:r>
-        <w:rPr>
-          <w:rFonts w:ascii="Bahnschrift SemiBold" w:hAnsi="Bahnschrift SemiBold" w:cstheme="minorHAnsi"/>
-          <w:b/>
-          <w:bCs/>
-          <w:color w:val="1A1A1A"/>
-        </w:rPr>
-        <w:t>]</w:t>
+        <w:t>Oscar David Roa Rativa</w:t>
+      </w:r>
+      <w:r>
+        <w:rPr>
+          <w:rFonts w:ascii="Bahnschrift SemiBold" w:hAnsi="Bahnschrift SemiBold" w:cstheme="minorHAnsi"/>
+          <w:b/>
+          <w:bCs/>
+          <w:color w:val="1A1A1A"/>
+        </w:rPr>
       </w:r>
     </w:p>
     <w:p>
@@ -3248,7 +3233,7 @@
           <w:sz w:val="20"/>
           <w:szCs w:val="20"/>
         </w:rPr>
-        <w:t>C.C. N.° _________________ | Accionista Fundador | 20%</w:t>
+        <w:t>C.C. N.° _________________ | Director Marketing &amp; Contenido AI | 20%</w:t>
       </w:r>
     </w:p>
     <w:p>

</xml_diff>